<commit_message>
Docs refresh and live (webR) versions of Lucas's sessions
- CLAUDE.md, SESSION_BUILD_GUIDE.md, README.md, Module2_task_checklist.docx:
  the 23 Sep documentation edits that had never been committed (session
  ownership table, palette and chart conventions, delivery checklist).
- New *_live.qmd decks for Lucas's sessions (1, 5, 7, 9, 11), built from the
  current text of each deck: Oct12 S1 (traffic-camera data), Oct13 S2 (RDD on
  the offered neighbourhoods only), Oct14 S1, Oct14 S3, Oct15 S2.
- theme_dge.scss: quoted prompts inside callouts one step smaller, in ink.
- .gitignore: every menti_qr*.png the decks generate.

The working copies of Oct12 S1-S3 and theme_editorial.scss were stale
(identical to b30ce08) and are set aside in a stash, not committed.

Co-Authored-By: Claude Opus 5.5 <noreply@anthropic.com>
</commit_message>
<xml_diff>
--- a/Module_2_Oct_2026_v2/Module2_task_checklist.docx
+++ b/Module_2_Oct_2026_v2/Module2_task_checklist.docx
@@ -250,190 +250,97 @@
           <w:sz w:val="24"/>
           <w:szCs w:val="24"/>
         </w:rPr>
-        <w:t xml:space="preserve">  GENERAL — across all sessions</w:t>
-      </w:r>
-    </w:p>
-    <w:p>
-      <w:pPr>
-        <w:spacing w:after="60"/>
-        <w:ind w:left="360" w:hanging="300"/>
-      </w:pPr>
-      <w:r>
-        <w:rPr>
-          <w:color w:val="131516"/>
-          <w:sz w:val="24"/>
-          <w:szCs w:val="24"/>
-        </w:rPr>
-        <w:t xml:space="preserve">☐  </w:t>
-      </w:r>
-      <w:r>
-        <w:rPr>
-          <w:b/>
-          <w:bCs/>
-          <w:color w:val="FFFFFF"/>
-          <w:sz w:val="15"/>
-          <w:szCs w:val="15"/>
-          <w:shd w:val="clear" w:color="auto" w:fill="9A2515"/>
-        </w:rPr>
-        <w:t xml:space="preserve"> FK </w:t>
-      </w:r>
-      <w:r>
-        <w:t xml:space="preserve">  </w:t>
-      </w:r>
-      <w:r>
-        <w:rPr>
-          <w:color w:val="131516"/>
-          <w:sz w:val="21"/>
-          <w:szCs w:val="21"/>
-        </w:rPr>
-        <w:t>Run the AI questions/tasks myself to capture examples of bad vs good responses</w:t>
-      </w:r>
-    </w:p>
-    <w:p>
-      <w:pPr>
-        <w:spacing w:after="60"/>
-        <w:ind w:left="360" w:hanging="300"/>
-      </w:pPr>
-      <w:r>
-        <w:rPr>
-          <w:color w:val="131516"/>
-          <w:sz w:val="24"/>
-          <w:szCs w:val="24"/>
-        </w:rPr>
-        <w:t xml:space="preserve">☐  </w:t>
-      </w:r>
-      <w:r>
-        <w:rPr>
-          <w:b/>
-          <w:bCs/>
-          <w:color w:val="FFFFFF"/>
-          <w:sz w:val="15"/>
-          <w:szCs w:val="15"/>
-          <w:shd w:val="clear" w:color="auto" w:fill="9A2515"/>
-        </w:rPr>
-        <w:t xml:space="preserve"> FK </w:t>
-      </w:r>
-      <w:r>
-        <w:t xml:space="preserve">  </w:t>
-      </w:r>
-      <w:r>
-        <w:rPr>
-          <w:color w:val="131516"/>
-          <w:sz w:val="21"/>
-          <w:szCs w:val="21"/>
-        </w:rPr>
-        <w:t>Think about ways to incorporate our "AI for IE" slides (and exercises, if we have any)</w:t>
-      </w:r>
-    </w:p>
-    <w:p>
-      <w:pPr>
-        <w:spacing w:after="60"/>
-        <w:ind w:left="360" w:hanging="300"/>
-        <w:rPr>
-          <w:color w:val="131516"/>
-          <w:sz w:val="21"/>
-          <w:szCs w:val="21"/>
-        </w:rPr>
-      </w:pPr>
-      <w:r>
-        <w:rPr>
-          <w:color w:val="131516"/>
-          <w:sz w:val="24"/>
-          <w:szCs w:val="24"/>
-        </w:rPr>
-        <w:t xml:space="preserve">☐  </w:t>
-      </w:r>
-      <w:r>
-        <w:rPr>
-          <w:b/>
-          <w:bCs/>
-          <w:color w:val="FFFFFF"/>
-          <w:sz w:val="15"/>
-          <w:szCs w:val="15"/>
-          <w:shd w:val="clear" w:color="auto" w:fill="9A2515"/>
-        </w:rPr>
-        <w:t xml:space="preserve"> FK </w:t>
-      </w:r>
-      <w:r>
-        <w:t xml:space="preserve">  </w:t>
-      </w:r>
-      <w:r>
-        <w:rPr>
-          <w:color w:val="131516"/>
-          <w:sz w:val="21"/>
-          <w:szCs w:val="21"/>
-        </w:rPr>
-        <w:t xml:space="preserve">Review wording across the materials to </w:t>
-      </w:r>
-      <w:r>
-        <w:rPr>
-          <w:color w:val="131516"/>
-          <w:sz w:val="21"/>
-          <w:szCs w:val="21"/>
-        </w:rPr>
-        <w:t xml:space="preserve">make sure it is clear but also not </w:t>
-      </w:r>
+        <w:t xml:space="preserve">  SESSION OWNERSHIP — agreed 23 Sep 2026</w:t>
+      </w:r>
+    </w:p>
+    <w:p>
+      <w:pPr>
+        <w:spacing w:after="160"/>
+      </w:pPr>
       <w:r>
         <w:rPr>
           <w:i/>
           <w:iCs/>
-          <w:color w:val="131516"/>
-          <w:sz w:val="21"/>
-          <w:szCs w:val="21"/>
-        </w:rPr>
-        <w:t>too</w:t>
-      </w:r>
-      <w:r>
-        <w:rPr>
-          <w:color w:val="131516"/>
-          <w:sz w:val="21"/>
-          <w:szCs w:val="21"/>
-        </w:rPr>
-        <w:t xml:space="preserve"> simple</w:t>
-      </w:r>
-    </w:p>
-    <w:p>
-      <w:pPr>
-        <w:spacing w:after="60"/>
-        <w:ind w:left="360" w:hanging="300"/>
-      </w:pPr>
-      <w:r>
-        <w:rPr>
-          <w:color w:val="131516"/>
-          <w:sz w:val="24"/>
-          <w:szCs w:val="24"/>
-        </w:rPr>
-        <w:t xml:space="preserve">☐  </w:t>
-      </w:r>
-      <w:r>
-        <w:rPr>
-          <w:b/>
-          <w:bCs/>
-          <w:color w:val="FFFFFF"/>
-          <w:sz w:val="15"/>
-          <w:szCs w:val="15"/>
-          <w:shd w:val="clear" w:color="auto" w:fill="5C6467"/>
-        </w:rPr>
-        <w:t xml:space="preserve">ASK · SEBASTIAN/MONICA/LUCAS </w:t>
-      </w:r>
-      <w:r>
-        <w:t xml:space="preserve"> </w:t>
-      </w:r>
-      <w:r>
-        <w:rPr>
-          <w:color w:val="131516"/>
-          <w:sz w:val="21"/>
-          <w:szCs w:val="21"/>
-        </w:rPr>
-        <w:t>Are the sessions too long? What to prioritize vs cut?</w:t>
-      </w:r>
-      <w:r>
-        <w:rPr>
-          <w:color w:val="131516"/>
-          <w:sz w:val="21"/>
-          <w:szCs w:val="21"/>
-        </w:rPr>
-        <w:t xml:space="preserve"> How can we improve the formatting (should we use ppt instead of quarto)?</w:t>
+          <w:color w:val="5C6467"/>
+          <w:sz w:val="18"/>
+          <w:szCs w:val="18"/>
+        </w:rPr>
+        <w:t xml:space="preserve">Owner is accountable for the session end to end; the other person is the second pair of eyes and reviews the live deck.</w:t>
+      </w:r>
+    </w:p>
+    <w:p>
+      <w:pPr>
+        <w:spacing w:after="160"/>
+      </w:pPr>
+      <w:r>
+        <w:rPr>
+          <w:i/>
+          <w:iCs/>
+          <w:color w:val="5C6467"/>
+          <w:sz w:val="18"/>
+          <w:szCs w:val="18"/>
+        </w:rPr>
+        <w:t xml:space="preserve">LUCAS   Oct 12 S1 · Oct 12 S3 · Oct 13 S2 · Oct 14 S1 · Oct 14 S3 · Oct 15 S2</w:t>
+      </w:r>
+    </w:p>
+    <w:p>
+      <w:pPr>
+        <w:spacing w:after="160"/>
+      </w:pPr>
+      <w:r>
+        <w:rPr>
+          <w:i/>
+          <w:iCs/>
+          <w:color w:val="5C6467"/>
+          <w:sz w:val="18"/>
+          <w:szCs w:val="18"/>
+        </w:rPr>
+        <w:t xml:space="preserve">FIONA   Oct 12 S2 · Oct 13 S1 · Oct 13 S3 · Oct 14 S2 · Oct 15 S1 · Oct 15 S3</w:t>
+      </w:r>
+    </w:p>
+    <w:p>
+      <w:pPr>
+        <w:spacing w:after="160"/>
+      </w:pPr>
+      <w:r>
+        <w:rPr>
+          <w:i/>
+          <w:iCs/>
+          <w:color w:val="5C6467"/>
+          <w:sz w:val="18"/>
+          <w:szCs w:val="18"/>
+        </w:rPr>
+        <w:t xml:space="preserve">Lucas reviews Fiona's six sessions; Fiona reviews Lucas's six.</w:t>
+      </w:r>
+    </w:p>
+    <w:p>
+      <w:pPr>
+        <w:spacing w:after="160"/>
+      </w:pPr>
+      <w:r>
+        <w:rPr>
+          <w:i/>
+          <w:iCs/>
+          <w:color w:val="5C6467"/>
+          <w:sz w:val="18"/>
+          <w:szCs w:val="18"/>
+        </w:rPr>
+        <w:t xml:space="preserve">All twelve decks are built and published. An owner is not the builder: the decks were built by Claude, and git history records who wrote what.</w:t>
+      </w:r>
+    </w:p>
+    <w:p>
+      <w:pPr>
+        <w:spacing w:after="160"/>
+      </w:pPr>
+      <w:r>
+        <w:rPr>
+          <w:i/>
+          <w:iCs/>
+          <w:color w:val="5C6467"/>
+          <w:sz w:val="18"/>
+          <w:szCs w:val="18"/>
+        </w:rPr>
+        <w:t xml:space="preserve">Still open on delivery: real case data for four decks (Oct13 S1 DOH, Oct13 S2 DCD, Oct13 S3 DCD Case 2, Oct14 S1 cost case), the Menti codes, and the four 2-hour sessions being short of their slide budget (Oct12 S3 26, Oct13 S3 25, Oct14 S3 23, Oct15 S3 18 slides).</w:t>
       </w:r>
     </w:p>
     <w:p>
@@ -452,25 +359,7 @@
           <w:sz w:val="24"/>
           <w:szCs w:val="24"/>
         </w:rPr>
-        <w:t xml:space="preserve">  DAY 1 · Oct 12</w:t>
-      </w:r>
-    </w:p>
-    <w:p>
-      <w:pPr>
-        <w:pBdr>
-          <w:bottom w:val="single" w:sz="4" w:space="0" w:color="DCE1E3"/>
-        </w:pBdr>
-        <w:spacing w:before="140" w:after="40"/>
-      </w:pPr>
-      <w:r>
-        <w:rPr>
-          <w:b/>
-          <w:bCs/>
-          <w:color w:val="131516"/>
-          <w:sz w:val="22"/>
-          <w:szCs w:val="22"/>
-        </w:rPr>
-        <w:t>Session 1 — Compared to What? / Know the Language First</w:t>
+        <w:t xml:space="preserve">  GENERAL — across all sessions</w:t>
       </w:r>
     </w:p>
     <w:p>
@@ -480,11 +369,11 @@
       </w:pPr>
       <w:r>
         <w:rPr>
-          <w:color w:val="1E7A46"/>
-          <w:sz w:val="24"/>
-          <w:szCs w:val="24"/>
-        </w:rPr>
-        <w:t xml:space="preserve">☑  </w:t>
+          <w:color w:val="131516"/>
+          <w:sz w:val="24"/>
+          <w:szCs w:val="24"/>
+        </w:rPr>
+        <w:t xml:space="preserve">☐  </w:t>
       </w:r>
       <w:r>
         <w:rPr>
@@ -506,7 +395,7 @@
           <w:sz w:val="21"/>
           <w:szCs w:val="21"/>
         </w:rPr>
-        <w:t>Drafted by FK</w:t>
+        <w:t>Run the AI questions/tasks myself to capture examples of bad vs good responses</w:t>
       </w:r>
     </w:p>
     <w:p>
@@ -542,61 +431,18 @@
           <w:sz w:val="21"/>
           <w:szCs w:val="21"/>
         </w:rPr>
-        <w:t>Review the draft</w:t>
-      </w:r>
-      <w:r>
-        <w:rPr>
-          <w:color w:val="131516"/>
-          <w:sz w:val="21"/>
-          <w:szCs w:val="21"/>
-        </w:rPr>
-        <w:t xml:space="preserve"> – need more detail and graphs to explain </w:t>
-      </w:r>
-      <w:proofErr w:type="spellStart"/>
-      <w:r>
-        <w:rPr>
-          <w:color w:val="131516"/>
-          <w:sz w:val="21"/>
-          <w:szCs w:val="21"/>
-        </w:rPr>
-        <w:t>pval</w:t>
-      </w:r>
-      <w:proofErr w:type="spellEnd"/>
-      <w:r>
-        <w:rPr>
-          <w:color w:val="131516"/>
-          <w:sz w:val="21"/>
-          <w:szCs w:val="21"/>
-        </w:rPr>
-        <w:t>, CIs, etc.</w:t>
-      </w:r>
-    </w:p>
-    <w:p>
-      <w:pPr>
-        <w:pBdr>
-          <w:bottom w:val="single" w:sz="4" w:space="0" w:color="DCE1E3"/>
-        </w:pBdr>
-        <w:spacing w:before="140" w:after="40"/>
-        <w:rPr>
-          <w:lang w:val="fr-FR"/>
-        </w:rPr>
-      </w:pPr>
-      <w:r>
-        <w:rPr>
-          <w:b/>
-          <w:bCs/>
-          <w:color w:val="131516"/>
-          <w:sz w:val="22"/>
-          <w:szCs w:val="22"/>
-          <w:lang w:val="fr-FR"/>
-        </w:rPr>
-        <w:t>Session 2 — Abu Dhabi Police (descriptives)</w:t>
+        <w:t>Think about ways to incorporate our "AI for IE" slides (and exercises, if we have any)</w:t>
       </w:r>
     </w:p>
     <w:p>
       <w:pPr>
         <w:spacing w:after="60"/>
         <w:ind w:left="360" w:hanging="300"/>
+        <w:rPr>
+          <w:color w:val="131516"/>
+          <w:sz w:val="21"/>
+          <w:szCs w:val="21"/>
+        </w:rPr>
       </w:pPr>
       <w:r>
         <w:rPr>
@@ -613,38 +459,46 @@
           <w:color w:val="FFFFFF"/>
           <w:sz w:val="15"/>
           <w:szCs w:val="15"/>
-          <w:shd w:val="clear" w:color="auto" w:fill="00789E"/>
-        </w:rPr>
-        <w:t xml:space="preserve"> LUCAS </w:t>
-      </w:r>
-      <w:r>
-        <w:t xml:space="preserve">  </w:t>
-      </w:r>
-      <w:r>
-        <w:rPr>
-          <w:color w:val="131516"/>
-          <w:sz w:val="21"/>
-          <w:szCs w:val="21"/>
-        </w:rPr>
-        <w:t>Build the session</w:t>
-      </w:r>
-    </w:p>
-    <w:p>
-      <w:pPr>
-        <w:pBdr>
-          <w:bottom w:val="single" w:sz="4" w:space="0" w:color="DCE1E3"/>
-        </w:pBdr>
-        <w:spacing w:before="140" w:after="40"/>
-      </w:pPr>
-      <w:r>
-        <w:rPr>
-          <w:b/>
-          <w:bCs/>
-          <w:color w:val="131516"/>
-          <w:sz w:val="22"/>
-          <w:szCs w:val="22"/>
-        </w:rPr>
-        <w:t>Session 3 — Spot the Problem / Naive Comparisons &amp; RCT</w:t>
+          <w:shd w:val="clear" w:color="auto" w:fill="9A2515"/>
+        </w:rPr>
+        <w:t xml:space="preserve"> FK </w:t>
+      </w:r>
+      <w:r>
+        <w:t xml:space="preserve">  </w:t>
+      </w:r>
+      <w:r>
+        <w:rPr>
+          <w:color w:val="131516"/>
+          <w:sz w:val="21"/>
+          <w:szCs w:val="21"/>
+        </w:rPr>
+        <w:t xml:space="preserve">Review wording across the materials to </w:t>
+      </w:r>
+      <w:r>
+        <w:rPr>
+          <w:color w:val="131516"/>
+          <w:sz w:val="21"/>
+          <w:szCs w:val="21"/>
+        </w:rPr>
+        <w:t xml:space="preserve">make sure it is clear but also not </w:t>
+      </w:r>
+      <w:r>
+        <w:rPr>
+          <w:i/>
+          <w:iCs/>
+          <w:color w:val="131516"/>
+          <w:sz w:val="21"/>
+          <w:szCs w:val="21"/>
+        </w:rPr>
+        <w:t>too</w:t>
+      </w:r>
+      <w:r>
+        <w:rPr>
+          <w:color w:val="131516"/>
+          <w:sz w:val="21"/>
+          <w:szCs w:val="21"/>
+        </w:rPr>
+        <w:t xml:space="preserve"> simple</w:t>
       </w:r>
     </w:p>
     <w:p>
@@ -654,116 +508,41 @@
       </w:pPr>
       <w:r>
         <w:rPr>
-          <w:color w:val="1E7A46"/>
-          <w:sz w:val="24"/>
-          <w:szCs w:val="24"/>
-        </w:rPr>
-        <w:t xml:space="preserve">☑  </w:t>
-      </w:r>
-      <w:r>
-        <w:rPr>
-          <w:b/>
-          <w:bCs/>
-          <w:color w:val="FFFFFF"/>
-          <w:sz w:val="15"/>
-          <w:szCs w:val="15"/>
-          <w:shd w:val="clear" w:color="auto" w:fill="9A2515"/>
-        </w:rPr>
-        <w:t xml:space="preserve"> FK </w:t>
-      </w:r>
-      <w:r>
-        <w:t xml:space="preserve">  </w:t>
-      </w:r>
-      <w:r>
-        <w:rPr>
-          <w:color w:val="131516"/>
-          <w:sz w:val="21"/>
-          <w:szCs w:val="21"/>
-        </w:rPr>
-        <w:t>Drafted by FK using old material</w:t>
-      </w:r>
-    </w:p>
-    <w:p>
-      <w:pPr>
-        <w:spacing w:after="60"/>
-        <w:ind w:left="360" w:hanging="300"/>
-      </w:pPr>
-      <w:r>
-        <w:rPr>
-          <w:color w:val="1E7A46"/>
-          <w:sz w:val="24"/>
-          <w:szCs w:val="24"/>
-        </w:rPr>
-        <w:t xml:space="preserve">☑  </w:t>
-      </w:r>
-      <w:r>
-        <w:rPr>
-          <w:b/>
-          <w:bCs/>
-          <w:color w:val="FFFFFF"/>
-          <w:sz w:val="15"/>
-          <w:szCs w:val="15"/>
-          <w:shd w:val="clear" w:color="auto" w:fill="9A2515"/>
-        </w:rPr>
+          <w:color w:val="131516"/>
+          <w:sz w:val="24"/>
+          <w:szCs w:val="24"/>
+        </w:rPr>
+        <w:t xml:space="preserve">☐  </w:t>
+      </w:r>
+      <w:r>
+        <w:rPr>
+          <w:b/>
+          <w:bCs/>
+          <w:color w:val="FFFFFF"/>
+          <w:sz w:val="15"/>
+          <w:szCs w:val="15"/>
+          <w:shd w:val="clear" w:color="auto" w:fill="5C6467"/>
+        </w:rPr>
+        <w:t xml:space="preserve">ASK · SEBASTIAN/MONICA/LUCAS </w:t>
+      </w:r>
+      <w:r>
         <w:t xml:space="preserve"> </w:t>
       </w:r>
       <w:r>
         <w:rPr>
-          <w:b/>
-          <w:bCs/>
-          <w:color w:val="FFFFFF"/>
-          <w:sz w:val="15"/>
-          <w:szCs w:val="15"/>
-          <w:shd w:val="clear" w:color="auto" w:fill="9A2515"/>
-        </w:rPr>
-        <w:t xml:space="preserve">FK </w:t>
-      </w:r>
-      <w:r>
-        <w:t xml:space="preserve">  </w:t>
-      </w:r>
-      <w:r>
-        <w:rPr>
-          <w:color w:val="131516"/>
-          <w:sz w:val="21"/>
-          <w:szCs w:val="21"/>
-        </w:rPr>
-        <w:t>Review the draft</w:t>
-      </w:r>
-    </w:p>
-    <w:p>
-      <w:pPr>
-        <w:spacing w:after="60"/>
-        <w:ind w:left="780" w:hanging="300"/>
-      </w:pPr>
-      <w:r>
-        <w:rPr>
-          <w:color w:val="131516"/>
-          <w:sz w:val="24"/>
-          <w:szCs w:val="24"/>
-        </w:rPr>
-        <w:t xml:space="preserve">☐  </w:t>
-      </w:r>
-      <w:r>
-        <w:rPr>
-          <w:b/>
-          <w:bCs/>
-          <w:color w:val="FFFFFF"/>
-          <w:sz w:val="15"/>
-          <w:szCs w:val="15"/>
-          <w:shd w:val="clear" w:color="auto" w:fill="00789E"/>
-        </w:rPr>
-        <w:t xml:space="preserve"> LUCAS </w:t>
-      </w:r>
-      <w:r>
-        <w:t xml:space="preserve">  </w:t>
-      </w:r>
-      <w:r>
-        <w:rPr>
-          <w:color w:val="131516"/>
-          <w:sz w:val="21"/>
-          <w:szCs w:val="21"/>
-        </w:rPr>
-        <w:t>Add the Abu Dhabi Police findings from Session 2 into the placeholder (as a comparison) once we have them</w:t>
+          <w:color w:val="131516"/>
+          <w:sz w:val="21"/>
+          <w:szCs w:val="21"/>
+        </w:rPr>
+        <w:t>Are the sessions too long? What to prioritize vs cut?</w:t>
+      </w:r>
+      <w:r>
+        <w:rPr>
+          <w:color w:val="131516"/>
+          <w:sz w:val="21"/>
+          <w:szCs w:val="21"/>
+        </w:rPr>
+        <w:t xml:space="preserve"> How can we improve the formatting (should we use ppt instead of quarto)?</w:t>
       </w:r>
     </w:p>
     <w:p>
@@ -782,29 +561,7 @@
           <w:sz w:val="24"/>
           <w:szCs w:val="24"/>
         </w:rPr>
-        <w:t xml:space="preserve">  DAY 2 · Oct 13  (one </w:t>
-      </w:r>
-      <w:proofErr w:type="spellStart"/>
-      <w:r>
-        <w:rPr>
-          <w:b/>
-          <w:bCs/>
-          <w:color w:val="FFFFFF"/>
-          <w:sz w:val="24"/>
-          <w:szCs w:val="24"/>
-        </w:rPr>
-        <w:t>programme</w:t>
-      </w:r>
-      <w:proofErr w:type="spellEnd"/>
-      <w:r>
-        <w:rPr>
-          <w:b/>
-          <w:bCs/>
-          <w:color w:val="FFFFFF"/>
-          <w:sz w:val="24"/>
-          <w:szCs w:val="24"/>
-        </w:rPr>
-        <w:t>, four methods)</w:t>
+        <w:t xml:space="preserve">  DAY 1 · Oct 12</w:t>
       </w:r>
     </w:p>
     <w:p>
@@ -822,51 +579,7 @@
           <w:sz w:val="22"/>
           <w:szCs w:val="22"/>
         </w:rPr>
-        <w:t xml:space="preserve">Session 1 — </w:t>
-      </w:r>
-      <w:proofErr w:type="spellStart"/>
-      <w:r>
-        <w:rPr>
-          <w:b/>
-          <w:bCs/>
-          <w:color w:val="131516"/>
-          <w:sz w:val="22"/>
-          <w:szCs w:val="22"/>
-        </w:rPr>
-        <w:t>DiD</w:t>
-      </w:r>
-      <w:proofErr w:type="spellEnd"/>
-      <w:r>
-        <w:rPr>
-          <w:b/>
-          <w:bCs/>
-          <w:color w:val="131516"/>
-          <w:sz w:val="22"/>
-          <w:szCs w:val="22"/>
-        </w:rPr>
-        <w:t xml:space="preserve"> (Reading </w:t>
-      </w:r>
-      <w:proofErr w:type="spellStart"/>
-      <w:r>
-        <w:rPr>
-          <w:b/>
-          <w:bCs/>
-          <w:color w:val="131516"/>
-          <w:sz w:val="22"/>
-          <w:szCs w:val="22"/>
-        </w:rPr>
-        <w:t>DiD</w:t>
-      </w:r>
-      <w:proofErr w:type="spellEnd"/>
-      <w:r>
-        <w:rPr>
-          <w:b/>
-          <w:bCs/>
-          <w:color w:val="131516"/>
-          <w:sz w:val="22"/>
-          <w:szCs w:val="22"/>
-        </w:rPr>
-        <w:t xml:space="preserve"> Results)</w:t>
+        <w:t>Session 1 — Compared to What? / Know the Language First</w:t>
       </w:r>
     </w:p>
     <w:p>
@@ -938,90 +651,33 @@
           <w:sz w:val="21"/>
           <w:szCs w:val="21"/>
         </w:rPr>
-        <w:t>Review; consider shortening further</w:t>
-      </w:r>
-    </w:p>
-    <w:p>
-      <w:pPr>
-        <w:spacing w:after="60"/>
-        <w:ind w:left="360" w:hanging="300"/>
-      </w:pPr>
-      <w:r>
-        <w:rPr>
-          <w:color w:val="1E7A46"/>
-          <w:sz w:val="24"/>
-          <w:szCs w:val="24"/>
-        </w:rPr>
-        <w:t xml:space="preserve">☑  </w:t>
-      </w:r>
-      <w:r>
-        <w:rPr>
-          <w:b/>
-          <w:bCs/>
-          <w:color w:val="FFFFFF"/>
-          <w:sz w:val="15"/>
-          <w:szCs w:val="15"/>
-          <w:shd w:val="clear" w:color="auto" w:fill="9A2515"/>
-        </w:rPr>
-        <w:t xml:space="preserve"> </w:t>
-      </w:r>
-      <w:r>
-        <w:rPr>
-          <w:b/>
-          <w:bCs/>
-          <w:color w:val="FFFFFF"/>
-          <w:sz w:val="15"/>
-          <w:szCs w:val="15"/>
-          <w:shd w:val="clear" w:color="auto" w:fill="9A2515"/>
-        </w:rPr>
-        <w:t xml:space="preserve">FK </w:t>
-      </w:r>
-      <w:r>
-        <w:t xml:space="preserve">  </w:t>
-      </w:r>
-      <w:r>
-        <w:rPr>
-          <w:color w:val="131516"/>
-          <w:sz w:val="21"/>
-          <w:szCs w:val="21"/>
-        </w:rPr>
-        <w:t>Compare the new version against the old one to make sure nothing important/better is missing</w:t>
-      </w:r>
-    </w:p>
-    <w:p>
-      <w:pPr>
-        <w:spacing w:after="60"/>
-        <w:ind w:left="780" w:hanging="300"/>
-      </w:pPr>
-      <w:r>
-        <w:rPr>
-          <w:color w:val="131516"/>
-          <w:sz w:val="24"/>
-          <w:szCs w:val="24"/>
-        </w:rPr>
-        <w:t xml:space="preserve">☐  </w:t>
-      </w:r>
-      <w:r>
-        <w:rPr>
-          <w:b/>
-          <w:bCs/>
-          <w:color w:val="FFFFFF"/>
-          <w:sz w:val="15"/>
-          <w:szCs w:val="15"/>
-          <w:shd w:val="clear" w:color="auto" w:fill="00789E"/>
-        </w:rPr>
-        <w:t xml:space="preserve"> LUCAS </w:t>
-      </w:r>
-      <w:r>
-        <w:t xml:space="preserve">  </w:t>
-      </w:r>
-      <w:r>
-        <w:rPr>
-          <w:color w:val="131516"/>
-          <w:sz w:val="21"/>
-          <w:szCs w:val="21"/>
-        </w:rPr>
-        <w:t>Add the case study (framed as an exercise for participants: description, code, and a few questions to answer)</w:t>
+        <w:t>Review the draft</w:t>
+      </w:r>
+      <w:r>
+        <w:rPr>
+          <w:color w:val="131516"/>
+          <w:sz w:val="21"/>
+          <w:szCs w:val="21"/>
+        </w:rPr>
+        <w:t xml:space="preserve"> – need more detail and graphs to explain </w:t>
+      </w:r>
+      <w:proofErr w:type="spellStart"/>
+      <w:r>
+        <w:rPr>
+          <w:color w:val="131516"/>
+          <w:sz w:val="21"/>
+          <w:szCs w:val="21"/>
+        </w:rPr>
+        <w:t>pval</w:t>
+      </w:r>
+      <w:proofErr w:type="spellEnd"/>
+      <w:r>
+        <w:rPr>
+          <w:color w:val="131516"/>
+          <w:sz w:val="21"/>
+          <w:szCs w:val="21"/>
+        </w:rPr>
+        <w:t>, CIs, etc.</w:t>
       </w:r>
     </w:p>
     <w:p>
@@ -1030,6 +686,9 @@
           <w:bottom w:val="single" w:sz="4" w:space="0" w:color="DCE1E3"/>
         </w:pBdr>
         <w:spacing w:before="140" w:after="40"/>
+        <w:rPr>
+          <w:lang w:val="fr-FR"/>
+        </w:rPr>
       </w:pPr>
       <w:r>
         <w:rPr>
@@ -1038,116 +697,23 @@
           <w:color w:val="131516"/>
           <w:sz w:val="22"/>
           <w:szCs w:val="22"/>
-        </w:rPr>
-        <w:t>Session 2 — RDD (Reading RDD Results)</w:t>
+          <w:lang w:val="fr-FR"/>
+        </w:rPr>
+        <w:t>Session 2 — Abu Dhabi Police (descriptives)</w:t>
       </w:r>
     </w:p>
     <w:p>
       <w:pPr>
         <w:spacing w:after="60"/>
         <w:ind w:left="360" w:hanging="300"/>
-        <w:rPr>
-          <w:color w:val="131516"/>
-          <w:sz w:val="21"/>
-          <w:szCs w:val="21"/>
-        </w:rPr>
-      </w:pPr>
-      <w:r>
-        <w:rPr>
-          <w:color w:val="1E7A46"/>
-          <w:sz w:val="24"/>
-          <w:szCs w:val="24"/>
-        </w:rPr>
-        <w:t>☑</w:t>
-      </w:r>
-      <w:r>
-        <w:rPr>
-          <w:color w:val="131516"/>
-          <w:sz w:val="24"/>
-          <w:szCs w:val="24"/>
-        </w:rPr>
-        <w:t xml:space="preserve">  </w:t>
-      </w:r>
-      <w:r>
-        <w:rPr>
-          <w:b/>
-          <w:bCs/>
-          <w:color w:val="FFFFFF"/>
-          <w:sz w:val="15"/>
-          <w:szCs w:val="15"/>
-          <w:shd w:val="clear" w:color="auto" w:fill="9A2515"/>
-        </w:rPr>
-        <w:t xml:space="preserve"> FK </w:t>
-      </w:r>
-      <w:r>
-        <w:t xml:space="preserve">  </w:t>
-      </w:r>
-      <w:r>
-        <w:rPr>
-          <w:color w:val="131516"/>
-          <w:sz w:val="21"/>
-          <w:szCs w:val="21"/>
-        </w:rPr>
-        <w:t>Draft with Claude</w:t>
-      </w:r>
-    </w:p>
-    <w:p>
-      <w:pPr>
-        <w:spacing w:after="60"/>
-        <w:ind w:left="360" w:hanging="300"/>
-      </w:pPr>
-      <w:r>
-        <w:rPr>
-          <w:color w:val="131516"/>
-          <w:sz w:val="24"/>
-          <w:szCs w:val="24"/>
-        </w:rPr>
-        <w:t xml:space="preserve">☐  </w:t>
-      </w:r>
-      <w:r>
-        <w:rPr>
-          <w:b/>
-          <w:bCs/>
-          <w:color w:val="FFFFFF"/>
-          <w:sz w:val="15"/>
-          <w:szCs w:val="15"/>
-          <w:shd w:val="clear" w:color="auto" w:fill="9A2515"/>
-        </w:rPr>
-        <w:t xml:space="preserve"> FK </w:t>
-      </w:r>
-      <w:r>
-        <w:t xml:space="preserve">  </w:t>
-      </w:r>
-      <w:r>
-        <w:rPr>
-          <w:color w:val="131516"/>
-          <w:sz w:val="21"/>
-          <w:szCs w:val="21"/>
-        </w:rPr>
-        <w:t>Review the draft</w:t>
-      </w:r>
-    </w:p>
-    <w:p>
-      <w:pPr>
-        <w:spacing w:after="60"/>
-        <w:ind w:left="780" w:hanging="300"/>
-      </w:pPr>
-      <w:r>
-        <w:rPr>
-          <w:rFonts w:ascii="Segoe UI Symbol" w:hAnsi="Segoe UI Symbol" w:cs="Segoe UI Symbol"/>
-          <w:color w:val="131516"/>
-          <w:sz w:val="24"/>
-          <w:szCs w:val="24"/>
-        </w:rPr>
-        <w:t>☐</w:t>
-      </w:r>
-      <w:r>
-        <w:rPr>
-          <w:color w:val="131516"/>
-          <w:sz w:val="24"/>
-          <w:szCs w:val="24"/>
-        </w:rPr>
-        <w:t xml:space="preserve">  </w:t>
+      </w:pPr>
+      <w:r>
+        <w:rPr>
+          <w:color w:val="131516"/>
+          <w:sz w:val="24"/>
+          <w:szCs w:val="24"/>
+        </w:rPr>
+        <w:t xml:space="preserve">☑  </w:t>
       </w:r>
       <w:r>
         <w:rPr>
@@ -1169,7 +735,7 @@
           <w:sz w:val="21"/>
           <w:szCs w:val="21"/>
         </w:rPr>
-        <w:t>Add the case study</w:t>
+        <w:t>Build the session</w:t>
       </w:r>
     </w:p>
     <w:p>
@@ -1187,18 +753,13 @@
           <w:sz w:val="22"/>
           <w:szCs w:val="22"/>
         </w:rPr>
-        <w:t>Session 3 — Matching (Reading Matching Results)</w:t>
+        <w:t>Session 3 — Spot the Problem / Naive Comparisons &amp; RCT</w:t>
       </w:r>
     </w:p>
     <w:p>
       <w:pPr>
         <w:spacing w:after="60"/>
         <w:ind w:left="360" w:hanging="300"/>
-        <w:rPr>
-          <w:color w:val="131516"/>
-          <w:sz w:val="21"/>
-          <w:szCs w:val="21"/>
-        </w:rPr>
       </w:pPr>
       <w:r>
         <w:rPr>
@@ -1206,15 +767,7 @@
           <w:sz w:val="24"/>
           <w:szCs w:val="24"/>
         </w:rPr>
-        <w:t>☑</w:t>
-      </w:r>
-      <w:r>
-        <w:rPr>
-          <w:color w:val="131516"/>
-          <w:sz w:val="24"/>
-          <w:szCs w:val="24"/>
-        </w:rPr>
-        <w:t xml:space="preserve">  </w:t>
+        <w:t xml:space="preserve">☑  </w:t>
       </w:r>
       <w:r>
         <w:rPr>
@@ -1236,34 +789,21 @@
           <w:sz w:val="21"/>
           <w:szCs w:val="21"/>
         </w:rPr>
-        <w:t>Draft with Claude</w:t>
-      </w:r>
-      <w:r>
-        <w:rPr>
-          <w:color w:val="131516"/>
-          <w:sz w:val="21"/>
-          <w:szCs w:val="21"/>
-        </w:rPr>
-        <w:t>, including PSM and CEM</w:t>
+        <w:t>Drafted by FK using old material</w:t>
       </w:r>
     </w:p>
     <w:p>
       <w:pPr>
         <w:spacing w:after="60"/>
         <w:ind w:left="360" w:hanging="300"/>
-        <w:rPr>
-          <w:color w:val="131516"/>
-          <w:sz w:val="21"/>
-          <w:szCs w:val="21"/>
-        </w:rPr>
-      </w:pPr>
-      <w:r>
-        <w:rPr>
-          <w:color w:val="131516"/>
-          <w:sz w:val="24"/>
-          <w:szCs w:val="24"/>
-        </w:rPr>
-        <w:t xml:space="preserve">☐  </w:t>
+      </w:pPr>
+      <w:r>
+        <w:rPr>
+          <w:color w:val="1E7A46"/>
+          <w:sz w:val="24"/>
+          <w:szCs w:val="24"/>
+        </w:rPr>
+        <w:t xml:space="preserve">☑  </w:t>
       </w:r>
       <w:r>
         <w:rPr>
@@ -1274,7 +814,18 @@
           <w:szCs w:val="15"/>
           <w:shd w:val="clear" w:color="auto" w:fill="9A2515"/>
         </w:rPr>
-        <w:t xml:space="preserve"> FK </w:t>
+        <w:t xml:space="preserve"> </w:t>
+      </w:r>
+      <w:r>
+        <w:rPr>
+          <w:b/>
+          <w:bCs/>
+          <w:color w:val="FFFFFF"/>
+          <w:sz w:val="15"/>
+          <w:szCs w:val="15"/>
+          <w:shd w:val="clear" w:color="auto" w:fill="9A2515"/>
+        </w:rPr>
+        <w:t xml:space="preserve">FK </w:t>
       </w:r>
       <w:r>
         <w:t xml:space="preserve">  </w:t>
@@ -1286,52 +837,6 @@
           <w:szCs w:val="21"/>
         </w:rPr>
         <w:t>Review the draft</w:t>
-      </w:r>
-    </w:p>
-    <w:p>
-      <w:pPr>
-        <w:spacing w:after="60"/>
-        <w:ind w:left="360" w:hanging="300"/>
-      </w:pPr>
-      <w:r>
-        <w:rPr>
-          <w:color w:val="131516"/>
-          <w:sz w:val="24"/>
-          <w:szCs w:val="24"/>
-        </w:rPr>
-        <w:lastRenderedPageBreak/>
-        <w:t xml:space="preserve">☐  </w:t>
-      </w:r>
-      <w:r>
-        <w:rPr>
-          <w:b/>
-          <w:bCs/>
-          <w:color w:val="FFFFFF"/>
-          <w:sz w:val="15"/>
-          <w:szCs w:val="15"/>
-          <w:shd w:val="clear" w:color="auto" w:fill="5C6467"/>
-        </w:rPr>
-        <w:t xml:space="preserve"> </w:t>
-      </w:r>
-      <w:r>
-        <w:rPr>
-          <w:b/>
-          <w:bCs/>
-          <w:color w:val="FFFFFF"/>
-          <w:sz w:val="15"/>
-          <w:szCs w:val="15"/>
-          <w:shd w:val="clear" w:color="auto" w:fill="5C6467"/>
-        </w:rPr>
-        <w:t xml:space="preserve">ASK · SEBASTIAN/MONICA/LUCAS </w:t>
-      </w:r>
-      <w:r>
-        <w:t xml:space="preserve"> do we want to keep </w:t>
-      </w:r>
-      <w:r>
-        <w:t xml:space="preserve">PSM </w:t>
-      </w:r>
-      <w:r>
-        <w:t>and CEM or just one of these?</w:t>
       </w:r>
     </w:p>
     <w:p>
@@ -1367,15 +872,7 @@
           <w:sz w:val="21"/>
           <w:szCs w:val="21"/>
         </w:rPr>
-        <w:t>Add the case study</w:t>
-      </w:r>
-      <w:r>
-        <w:rPr>
-          <w:color w:val="131516"/>
-          <w:sz w:val="21"/>
-          <w:szCs w:val="21"/>
-        </w:rPr>
-        <w:t xml:space="preserve"> </w:t>
+        <w:t>Add the Abu Dhabi Police findings from Session 2 into the placeholder (as a comparison) once we have them</w:t>
       </w:r>
     </w:p>
     <w:p>
@@ -1394,7 +891,29 @@
           <w:sz w:val="24"/>
           <w:szCs w:val="24"/>
         </w:rPr>
-        <w:t xml:space="preserve">  DAY 3 · Oct 14</w:t>
+        <w:t xml:space="preserve">  DAY 2 · Oct 13  (one </w:t>
+      </w:r>
+      <w:proofErr w:type="spellStart"/>
+      <w:r>
+        <w:rPr>
+          <w:b/>
+          <w:bCs/>
+          <w:color w:val="FFFFFF"/>
+          <w:sz w:val="24"/>
+          <w:szCs w:val="24"/>
+        </w:rPr>
+        <w:t>programme</w:t>
+      </w:r>
+      <w:proofErr w:type="spellEnd"/>
+      <w:r>
+        <w:rPr>
+          <w:b/>
+          <w:bCs/>
+          <w:color w:val="FFFFFF"/>
+          <w:sz w:val="24"/>
+          <w:szCs w:val="24"/>
+        </w:rPr>
+        <w:t>, four methods)</w:t>
       </w:r>
     </w:p>
     <w:p>
@@ -1412,7 +931,51 @@
           <w:sz w:val="22"/>
           <w:szCs w:val="22"/>
         </w:rPr>
-        <w:t>Session 1 — Cost Analysis</w:t>
+        <w:t xml:space="preserve">Session 1 — </w:t>
+      </w:r>
+      <w:proofErr w:type="spellStart"/>
+      <w:r>
+        <w:rPr>
+          <w:b/>
+          <w:bCs/>
+          <w:color w:val="131516"/>
+          <w:sz w:val="22"/>
+          <w:szCs w:val="22"/>
+        </w:rPr>
+        <w:t>DiD</w:t>
+      </w:r>
+      <w:proofErr w:type="spellEnd"/>
+      <w:r>
+        <w:rPr>
+          <w:b/>
+          <w:bCs/>
+          <w:color w:val="131516"/>
+          <w:sz w:val="22"/>
+          <w:szCs w:val="22"/>
+        </w:rPr>
+        <w:t xml:space="preserve"> (Reading </w:t>
+      </w:r>
+      <w:proofErr w:type="spellStart"/>
+      <w:r>
+        <w:rPr>
+          <w:b/>
+          <w:bCs/>
+          <w:color w:val="131516"/>
+          <w:sz w:val="22"/>
+          <w:szCs w:val="22"/>
+        </w:rPr>
+        <w:t>DiD</w:t>
+      </w:r>
+      <w:proofErr w:type="spellEnd"/>
+      <w:r>
+        <w:rPr>
+          <w:b/>
+          <w:bCs/>
+          <w:color w:val="131516"/>
+          <w:sz w:val="22"/>
+          <w:szCs w:val="22"/>
+        </w:rPr>
+        <w:t xml:space="preserve"> Results)</w:t>
       </w:r>
     </w:p>
     <w:p>
@@ -1422,6 +985,42 @@
       </w:pPr>
       <w:r>
         <w:rPr>
+          <w:color w:val="1E7A46"/>
+          <w:sz w:val="24"/>
+          <w:szCs w:val="24"/>
+        </w:rPr>
+        <w:t xml:space="preserve">☑  </w:t>
+      </w:r>
+      <w:r>
+        <w:rPr>
+          <w:b/>
+          <w:bCs/>
+          <w:color w:val="FFFFFF"/>
+          <w:sz w:val="15"/>
+          <w:szCs w:val="15"/>
+          <w:shd w:val="clear" w:color="auto" w:fill="9A2515"/>
+        </w:rPr>
+        <w:t xml:space="preserve"> FK </w:t>
+      </w:r>
+      <w:r>
+        <w:t xml:space="preserve">  </w:t>
+      </w:r>
+      <w:r>
+        <w:rPr>
+          <w:color w:val="131516"/>
+          <w:sz w:val="21"/>
+          <w:szCs w:val="21"/>
+        </w:rPr>
+        <w:t>Drafted by FK</w:t>
+      </w:r>
+    </w:p>
+    <w:p>
+      <w:pPr>
+        <w:spacing w:after="60"/>
+        <w:ind w:left="360" w:hanging="300"/>
+      </w:pPr>
+      <w:r>
+        <w:rPr>
           <w:color w:val="131516"/>
           <w:sz w:val="24"/>
           <w:szCs w:val="24"/>
@@ -1435,6 +1034,89 @@
           <w:color w:val="FFFFFF"/>
           <w:sz w:val="15"/>
           <w:szCs w:val="15"/>
+          <w:shd w:val="clear" w:color="auto" w:fill="9A2515"/>
+        </w:rPr>
+        <w:t xml:space="preserve"> FK </w:t>
+      </w:r>
+      <w:r>
+        <w:t xml:space="preserve">  </w:t>
+      </w:r>
+      <w:r>
+        <w:rPr>
+          <w:color w:val="131516"/>
+          <w:sz w:val="21"/>
+          <w:szCs w:val="21"/>
+        </w:rPr>
+        <w:t>Review; consider shortening further</w:t>
+      </w:r>
+    </w:p>
+    <w:p>
+      <w:pPr>
+        <w:spacing w:after="60"/>
+        <w:ind w:left="360" w:hanging="300"/>
+      </w:pPr>
+      <w:r>
+        <w:rPr>
+          <w:color w:val="1E7A46"/>
+          <w:sz w:val="24"/>
+          <w:szCs w:val="24"/>
+        </w:rPr>
+        <w:t xml:space="preserve">☑  </w:t>
+      </w:r>
+      <w:r>
+        <w:rPr>
+          <w:b/>
+          <w:bCs/>
+          <w:color w:val="FFFFFF"/>
+          <w:sz w:val="15"/>
+          <w:szCs w:val="15"/>
+          <w:shd w:val="clear" w:color="auto" w:fill="9A2515"/>
+        </w:rPr>
+        <w:t xml:space="preserve"> </w:t>
+      </w:r>
+      <w:r>
+        <w:rPr>
+          <w:b/>
+          <w:bCs/>
+          <w:color w:val="FFFFFF"/>
+          <w:sz w:val="15"/>
+          <w:szCs w:val="15"/>
+          <w:shd w:val="clear" w:color="auto" w:fill="9A2515"/>
+        </w:rPr>
+        <w:t xml:space="preserve">FK </w:t>
+      </w:r>
+      <w:r>
+        <w:t xml:space="preserve">  </w:t>
+      </w:r>
+      <w:r>
+        <w:rPr>
+          <w:color w:val="131516"/>
+          <w:sz w:val="21"/>
+          <w:szCs w:val="21"/>
+        </w:rPr>
+        <w:t>Compare the new version against the old one to make sure nothing important/better is missing</w:t>
+      </w:r>
+    </w:p>
+    <w:p>
+      <w:pPr>
+        <w:spacing w:after="60"/>
+        <w:ind w:left="780" w:hanging="300"/>
+      </w:pPr>
+      <w:r>
+        <w:rPr>
+          <w:color w:val="131516"/>
+          <w:sz w:val="24"/>
+          <w:szCs w:val="24"/>
+        </w:rPr>
+        <w:t xml:space="preserve">☐  </w:t>
+      </w:r>
+      <w:r>
+        <w:rPr>
+          <w:b/>
+          <w:bCs/>
+          <w:color w:val="FFFFFF"/>
+          <w:sz w:val="15"/>
+          <w:szCs w:val="15"/>
           <w:shd w:val="clear" w:color="auto" w:fill="00789E"/>
         </w:rPr>
         <w:t xml:space="preserve"> LUCAS </w:t>
@@ -1448,7 +1130,7 @@
           <w:sz w:val="21"/>
           <w:szCs w:val="21"/>
         </w:rPr>
-        <w:t>Build the session</w:t>
+        <w:t>Add the case study (framed as an exercise for participants: description, code, and a few questions to answer)</w:t>
       </w:r>
     </w:p>
     <w:p>
@@ -1466,25 +1148,62 @@
           <w:sz w:val="22"/>
           <w:szCs w:val="22"/>
         </w:rPr>
-        <w:t xml:space="preserve">Session 2 — Data </w:t>
-      </w:r>
-      <w:proofErr w:type="spellStart"/>
-      <w:r>
-        <w:rPr>
-          <w:b/>
-          <w:bCs/>
-          <w:color w:val="131516"/>
-          <w:sz w:val="22"/>
-          <w:szCs w:val="22"/>
-        </w:rPr>
-        <w:t>Visualisation</w:t>
-      </w:r>
-      <w:proofErr w:type="spellEnd"/>
+        <w:t>Session 2 — RDD (Reading RDD Results)</w:t>
+      </w:r>
     </w:p>
     <w:p>
       <w:pPr>
         <w:spacing w:after="60"/>
         <w:ind w:left="360" w:hanging="300"/>
+        <w:rPr>
+          <w:color w:val="131516"/>
+          <w:sz w:val="21"/>
+          <w:szCs w:val="21"/>
+        </w:rPr>
+      </w:pPr>
+      <w:r>
+        <w:rPr>
+          <w:color w:val="1E7A46"/>
+          <w:sz w:val="24"/>
+          <w:szCs w:val="24"/>
+        </w:rPr>
+        <w:t>☑</w:t>
+      </w:r>
+      <w:r>
+        <w:rPr>
+          <w:color w:val="131516"/>
+          <w:sz w:val="24"/>
+          <w:szCs w:val="24"/>
+        </w:rPr>
+        <w:t xml:space="preserve">  </w:t>
+      </w:r>
+      <w:r>
+        <w:rPr>
+          <w:b/>
+          <w:bCs/>
+          <w:color w:val="FFFFFF"/>
+          <w:sz w:val="15"/>
+          <w:szCs w:val="15"/>
+          <w:shd w:val="clear" w:color="auto" w:fill="9A2515"/>
+        </w:rPr>
+        <w:t xml:space="preserve"> FK </w:t>
+      </w:r>
+      <w:r>
+        <w:t xml:space="preserve">  </w:t>
+      </w:r>
+      <w:r>
+        <w:rPr>
+          <w:color w:val="131516"/>
+          <w:sz w:val="21"/>
+          <w:szCs w:val="21"/>
+        </w:rPr>
+        <w:t>Draft with Claude</w:t>
+      </w:r>
+    </w:p>
+    <w:p>
+      <w:pPr>
+        <w:spacing w:after="60"/>
+        <w:ind w:left="360" w:hanging="300"/>
       </w:pPr>
       <w:r>
         <w:rPr>
@@ -1501,6 +1220,51 @@
           <w:color w:val="FFFFFF"/>
           <w:sz w:val="15"/>
           <w:szCs w:val="15"/>
+          <w:shd w:val="clear" w:color="auto" w:fill="9A2515"/>
+        </w:rPr>
+        <w:t xml:space="preserve"> FK </w:t>
+      </w:r>
+      <w:r>
+        <w:t xml:space="preserve">  </w:t>
+      </w:r>
+      <w:r>
+        <w:rPr>
+          <w:color w:val="131516"/>
+          <w:sz w:val="21"/>
+          <w:szCs w:val="21"/>
+        </w:rPr>
+        <w:t>Review the draft</w:t>
+      </w:r>
+    </w:p>
+    <w:p>
+      <w:pPr>
+        <w:spacing w:after="60"/>
+        <w:ind w:left="780" w:hanging="300"/>
+      </w:pPr>
+      <w:r>
+        <w:rPr>
+          <w:rFonts w:ascii="Segoe UI Symbol" w:hAnsi="Segoe UI Symbol" w:cs="Segoe UI Symbol"/>
+          <w:color w:val="131516"/>
+          <w:sz w:val="24"/>
+          <w:szCs w:val="24"/>
+        </w:rPr>
+        <w:t>☐</w:t>
+      </w:r>
+      <w:r>
+        <w:rPr>
+          <w:color w:val="131516"/>
+          <w:sz w:val="24"/>
+          <w:szCs w:val="24"/>
+        </w:rPr>
+        <w:t xml:space="preserve">  </w:t>
+      </w:r>
+      <w:r>
+        <w:rPr>
+          <w:b/>
+          <w:bCs/>
+          <w:color w:val="FFFFFF"/>
+          <w:sz w:val="15"/>
+          <w:szCs w:val="15"/>
           <w:shd w:val="clear" w:color="auto" w:fill="00789E"/>
         </w:rPr>
         <w:t xml:space="preserve"> LUCAS </w:t>
@@ -1514,7 +1278,7 @@
           <w:sz w:val="21"/>
           <w:szCs w:val="21"/>
         </w:rPr>
-        <w:t>Build the session</w:t>
+        <w:t>Add the case study</w:t>
       </w:r>
     </w:p>
     <w:p>
@@ -1532,7 +1296,7 @@
           <w:sz w:val="22"/>
           <w:szCs w:val="22"/>
         </w:rPr>
-        <w:t>Session 3 — "Interrogate the Analyst" QA Clinic</w:t>
+        <w:t>Session 3 — Matching (Reading Matching Results)</w:t>
       </w:r>
     </w:p>
     <w:p>
@@ -1547,47 +1311,60 @@
       </w:pPr>
       <w:r>
         <w:rPr>
-          <w:color w:val="131516"/>
-          <w:sz w:val="24"/>
-          <w:szCs w:val="24"/>
-        </w:rPr>
-        <w:t xml:space="preserve">☐  </w:t>
-      </w:r>
-      <w:r>
-        <w:rPr>
-          <w:b/>
-          <w:bCs/>
-          <w:color w:val="FFFFFF"/>
-          <w:sz w:val="15"/>
-          <w:szCs w:val="15"/>
-          <w:shd w:val="clear" w:color="auto" w:fill="00789E"/>
-        </w:rPr>
-        <w:t xml:space="preserve"> LUCAS </w:t>
-      </w:r>
-      <w:r>
-        <w:t xml:space="preserve">  </w:t>
-      </w:r>
-      <w:r>
-        <w:rPr>
-          <w:color w:val="131516"/>
-          <w:sz w:val="21"/>
-          <w:szCs w:val="21"/>
-        </w:rPr>
-        <w:t>Build the session</w:t>
-      </w:r>
-      <w:r>
-        <w:rPr>
-          <w:color w:val="131516"/>
-          <w:sz w:val="21"/>
-          <w:szCs w:val="21"/>
-        </w:rPr>
-        <w:t xml:space="preserve"> - do we have an existing QA checklist in mind?</w:t>
+          <w:color w:val="1E7A46"/>
+          <w:sz w:val="24"/>
+          <w:szCs w:val="24"/>
+        </w:rPr>
+        <w:t>☑</w:t>
+      </w:r>
+      <w:r>
+        <w:rPr>
+          <w:color w:val="131516"/>
+          <w:sz w:val="24"/>
+          <w:szCs w:val="24"/>
+        </w:rPr>
+        <w:t xml:space="preserve">  </w:t>
+      </w:r>
+      <w:r>
+        <w:rPr>
+          <w:b/>
+          <w:bCs/>
+          <w:color w:val="FFFFFF"/>
+          <w:sz w:val="15"/>
+          <w:szCs w:val="15"/>
+          <w:shd w:val="clear" w:color="auto" w:fill="9A2515"/>
+        </w:rPr>
+        <w:t xml:space="preserve"> FK </w:t>
+      </w:r>
+      <w:r>
+        <w:t xml:space="preserve">  </w:t>
+      </w:r>
+      <w:r>
+        <w:rPr>
+          <w:color w:val="131516"/>
+          <w:sz w:val="21"/>
+          <w:szCs w:val="21"/>
+        </w:rPr>
+        <w:t>Draft with Claude</w:t>
+      </w:r>
+      <w:r>
+        <w:rPr>
+          <w:color w:val="131516"/>
+          <w:sz w:val="21"/>
+          <w:szCs w:val="21"/>
+        </w:rPr>
+        <w:t>, including PSM and CEM</w:t>
       </w:r>
     </w:p>
     <w:p>
       <w:pPr>
         <w:spacing w:after="60"/>
         <w:ind w:left="360" w:hanging="300"/>
+        <w:rPr>
+          <w:color w:val="131516"/>
+          <w:sz w:val="21"/>
+          <w:szCs w:val="21"/>
+        </w:rPr>
       </w:pPr>
       <w:r>
         <w:rPr>
@@ -1617,31 +1394,7 @@
           <w:sz w:val="21"/>
           <w:szCs w:val="21"/>
         </w:rPr>
-        <w:t>Check</w:t>
-      </w:r>
-      <w:r>
-        <w:rPr>
-          <w:color w:val="131516"/>
-          <w:sz w:val="21"/>
-          <w:szCs w:val="21"/>
-        </w:rPr>
-        <w:t xml:space="preserve"> my notes for </w:t>
-      </w:r>
-      <w:r>
-        <w:rPr>
-          <w:color w:val="131516"/>
-          <w:sz w:val="21"/>
-          <w:szCs w:val="21"/>
-        </w:rPr>
-        <w:t>some</w:t>
-      </w:r>
-      <w:r>
-        <w:rPr>
-          <w:color w:val="131516"/>
-          <w:sz w:val="21"/>
-          <w:szCs w:val="21"/>
-        </w:rPr>
-        <w:t xml:space="preserve"> critical questions I think they should ask AI</w:t>
+        <w:t>Review the draft</w:t>
       </w:r>
     </w:p>
     <w:p>
@@ -1655,6 +1408,7 @@
           <w:sz w:val="24"/>
           <w:szCs w:val="24"/>
         </w:rPr>
+        <w:lastRenderedPageBreak/>
         <w:t xml:space="preserve">☐  </w:t>
       </w:r>
       <w:r>
@@ -1664,28 +1418,73 @@
           <w:color w:val="FFFFFF"/>
           <w:sz w:val="15"/>
           <w:szCs w:val="15"/>
-          <w:shd w:val="clear" w:color="auto" w:fill="9A2515"/>
-        </w:rPr>
-        <w:t xml:space="preserve"> FK </w:t>
-      </w:r>
-      <w:r>
-        <w:t xml:space="preserve">  </w:t>
-      </w:r>
-      <w:r>
-        <w:rPr>
-          <w:color w:val="131516"/>
-          <w:sz w:val="21"/>
-          <w:szCs w:val="21"/>
-        </w:rPr>
-        <w:t>May be a good</w:t>
-      </w:r>
-      <w:r>
-        <w:rPr>
-          <w:color w:val="131516"/>
-          <w:sz w:val="21"/>
-          <w:szCs w:val="21"/>
-        </w:rPr>
-        <w:t xml:space="preserve"> place to add some AI content</w:t>
+          <w:shd w:val="clear" w:color="auto" w:fill="5C6467"/>
+        </w:rPr>
+        <w:t xml:space="preserve"> </w:t>
+      </w:r>
+      <w:r>
+        <w:rPr>
+          <w:b/>
+          <w:bCs/>
+          <w:color w:val="FFFFFF"/>
+          <w:sz w:val="15"/>
+          <w:szCs w:val="15"/>
+          <w:shd w:val="clear" w:color="auto" w:fill="5C6467"/>
+        </w:rPr>
+        <w:t xml:space="preserve">ASK · SEBASTIAN/MONICA/LUCAS </w:t>
+      </w:r>
+      <w:r>
+        <w:t xml:space="preserve"> do we want to keep </w:t>
+      </w:r>
+      <w:r>
+        <w:t xml:space="preserve">PSM </w:t>
+      </w:r>
+      <w:r>
+        <w:t>and CEM or just one of these?</w:t>
+      </w:r>
+    </w:p>
+    <w:p>
+      <w:pPr>
+        <w:spacing w:after="60"/>
+        <w:ind w:left="780" w:hanging="300"/>
+      </w:pPr>
+      <w:r>
+        <w:rPr>
+          <w:color w:val="131516"/>
+          <w:sz w:val="24"/>
+          <w:szCs w:val="24"/>
+        </w:rPr>
+        <w:t xml:space="preserve">☐  </w:t>
+      </w:r>
+      <w:r>
+        <w:rPr>
+          <w:b/>
+          <w:bCs/>
+          <w:color w:val="FFFFFF"/>
+          <w:sz w:val="15"/>
+          <w:szCs w:val="15"/>
+          <w:shd w:val="clear" w:color="auto" w:fill="00789E"/>
+        </w:rPr>
+        <w:t xml:space="preserve"> LUCAS </w:t>
+      </w:r>
+      <w:r>
+        <w:t xml:space="preserve">  </w:t>
+      </w:r>
+      <w:r>
+        <w:rPr>
+          <w:color w:val="131516"/>
+          <w:sz w:val="21"/>
+          <w:szCs w:val="21"/>
+        </w:rPr>
+        <w:t>Add the case study</w:t>
+      </w:r>
+      <w:r>
+        <w:rPr>
+          <w:color w:val="131516"/>
+          <w:sz w:val="21"/>
+          <w:szCs w:val="21"/>
+        </w:rPr>
+        <w:t xml:space="preserve"> </w:t>
       </w:r>
     </w:p>
     <w:p>
@@ -1704,7 +1503,7 @@
           <w:sz w:val="24"/>
           <w:szCs w:val="24"/>
         </w:rPr>
-        <w:t xml:space="preserve">  DAY 4 · Oct 15</w:t>
+        <w:t xml:space="preserve">  DAY 3 · Oct 14</w:t>
       </w:r>
     </w:p>
     <w:p>
@@ -1722,7 +1521,7 @@
           <w:sz w:val="22"/>
           <w:szCs w:val="22"/>
         </w:rPr>
-        <w:t>Session 1 — Is This Evidence Credible? / QA Deep Dive</w:t>
+        <w:t>Session 1 — Cost Analysis</w:t>
       </w:r>
     </w:p>
     <w:p>
@@ -1736,7 +1535,317 @@
           <w:sz w:val="24"/>
           <w:szCs w:val="24"/>
         </w:rPr>
+        <w:t xml:space="preserve">☑  </w:t>
+      </w:r>
+      <w:r>
+        <w:rPr>
+          <w:b/>
+          <w:bCs/>
+          <w:color w:val="FFFFFF"/>
+          <w:sz w:val="15"/>
+          <w:szCs w:val="15"/>
+          <w:shd w:val="clear" w:color="auto" w:fill="00789E"/>
+        </w:rPr>
+        <w:t xml:space="preserve"> LUCAS </w:t>
+      </w:r>
+      <w:r>
+        <w:t xml:space="preserve">  </w:t>
+      </w:r>
+      <w:r>
+        <w:rPr>
+          <w:color w:val="131516"/>
+          <w:sz w:val="21"/>
+          <w:szCs w:val="21"/>
+        </w:rPr>
+        <w:t>Build the session</w:t>
+      </w:r>
+    </w:p>
+    <w:p>
+      <w:pPr>
+        <w:pBdr>
+          <w:bottom w:val="single" w:sz="4" w:space="0" w:color="DCE1E3"/>
+        </w:pBdr>
+        <w:spacing w:before="140" w:after="40"/>
+      </w:pPr>
+      <w:r>
+        <w:rPr>
+          <w:b/>
+          <w:bCs/>
+          <w:color w:val="131516"/>
+          <w:sz w:val="22"/>
+          <w:szCs w:val="22"/>
+        </w:rPr>
+        <w:t xml:space="preserve">Session 2 — Data </w:t>
+      </w:r>
+      <w:proofErr w:type="spellStart"/>
+      <w:r>
+        <w:rPr>
+          <w:b/>
+          <w:bCs/>
+          <w:color w:val="131516"/>
+          <w:sz w:val="22"/>
+          <w:szCs w:val="22"/>
+        </w:rPr>
+        <w:t>Visualisation</w:t>
+      </w:r>
+      <w:proofErr w:type="spellEnd"/>
+    </w:p>
+    <w:p>
+      <w:pPr>
+        <w:spacing w:after="60"/>
+        <w:ind w:left="360" w:hanging="300"/>
+      </w:pPr>
+      <w:r>
+        <w:rPr>
+          <w:color w:val="131516"/>
+          <w:sz w:val="24"/>
+          <w:szCs w:val="24"/>
+        </w:rPr>
+        <w:t xml:space="preserve">☑  </w:t>
+      </w:r>
+      <w:r>
+        <w:rPr>
+          <w:b/>
+          <w:bCs/>
+          <w:color w:val="FFFFFF"/>
+          <w:sz w:val="15"/>
+          <w:szCs w:val="15"/>
+          <w:shd w:val="clear" w:color="auto" w:fill="00789E"/>
+        </w:rPr>
+        <w:t xml:space="preserve"> LUCAS </w:t>
+      </w:r>
+      <w:r>
+        <w:t xml:space="preserve">  </w:t>
+      </w:r>
+      <w:r>
+        <w:rPr>
+          <w:color w:val="131516"/>
+          <w:sz w:val="21"/>
+          <w:szCs w:val="21"/>
+        </w:rPr>
+        <w:t>Build the session</w:t>
+      </w:r>
+    </w:p>
+    <w:p>
+      <w:pPr>
+        <w:pBdr>
+          <w:bottom w:val="single" w:sz="4" w:space="0" w:color="DCE1E3"/>
+        </w:pBdr>
+        <w:spacing w:before="140" w:after="40"/>
+      </w:pPr>
+      <w:r>
+        <w:rPr>
+          <w:b/>
+          <w:bCs/>
+          <w:color w:val="131516"/>
+          <w:sz w:val="22"/>
+          <w:szCs w:val="22"/>
+        </w:rPr>
+        <w:t>Session 3 — "Interrogate the Analyst" QA Clinic</w:t>
+      </w:r>
+    </w:p>
+    <w:p>
+      <w:pPr>
+        <w:spacing w:after="60"/>
+        <w:ind w:left="360" w:hanging="300"/>
+        <w:rPr>
+          <w:color w:val="131516"/>
+          <w:sz w:val="21"/>
+          <w:szCs w:val="21"/>
+        </w:rPr>
+      </w:pPr>
+      <w:r>
+        <w:rPr>
+          <w:color w:val="131516"/>
+          <w:sz w:val="24"/>
+          <w:szCs w:val="24"/>
+        </w:rPr>
+        <w:t xml:space="preserve">☑  </w:t>
+      </w:r>
+      <w:r>
+        <w:rPr>
+          <w:b/>
+          <w:bCs/>
+          <w:color w:val="FFFFFF"/>
+          <w:sz w:val="15"/>
+          <w:szCs w:val="15"/>
+          <w:shd w:val="clear" w:color="auto" w:fill="00789E"/>
+        </w:rPr>
+        <w:t xml:space="preserve"> LUCAS </w:t>
+      </w:r>
+      <w:r>
+        <w:t xml:space="preserve">  </w:t>
+      </w:r>
+      <w:r>
+        <w:rPr>
+          <w:color w:val="131516"/>
+          <w:sz w:val="21"/>
+          <w:szCs w:val="21"/>
+        </w:rPr>
+        <w:t>Build the session</w:t>
+      </w:r>
+      <w:r>
+        <w:rPr>
+          <w:color w:val="131516"/>
+          <w:sz w:val="21"/>
+          <w:szCs w:val="21"/>
+        </w:rPr>
+        <w:t xml:space="preserve"> - do we have an existing QA checklist in mind?</w:t>
+      </w:r>
+    </w:p>
+    <w:p>
+      <w:pPr>
+        <w:spacing w:after="60"/>
+        <w:ind w:left="360" w:hanging="300"/>
+      </w:pPr>
+      <w:r>
+        <w:rPr>
+          <w:color w:val="131516"/>
+          <w:sz w:val="24"/>
+          <w:szCs w:val="24"/>
+        </w:rPr>
         <w:t xml:space="preserve">☐  </w:t>
+      </w:r>
+      <w:r>
+        <w:rPr>
+          <w:b/>
+          <w:bCs/>
+          <w:color w:val="FFFFFF"/>
+          <w:sz w:val="15"/>
+          <w:szCs w:val="15"/>
+          <w:shd w:val="clear" w:color="auto" w:fill="9A2515"/>
+        </w:rPr>
+        <w:t xml:space="preserve"> FK </w:t>
+      </w:r>
+      <w:r>
+        <w:t xml:space="preserve">  </w:t>
+      </w:r>
+      <w:r>
+        <w:rPr>
+          <w:color w:val="131516"/>
+          <w:sz w:val="21"/>
+          <w:szCs w:val="21"/>
+        </w:rPr>
+        <w:t>Check</w:t>
+      </w:r>
+      <w:r>
+        <w:rPr>
+          <w:color w:val="131516"/>
+          <w:sz w:val="21"/>
+          <w:szCs w:val="21"/>
+        </w:rPr>
+        <w:t xml:space="preserve"> my notes for </w:t>
+      </w:r>
+      <w:r>
+        <w:rPr>
+          <w:color w:val="131516"/>
+          <w:sz w:val="21"/>
+          <w:szCs w:val="21"/>
+        </w:rPr>
+        <w:t>some</w:t>
+      </w:r>
+      <w:r>
+        <w:rPr>
+          <w:color w:val="131516"/>
+          <w:sz w:val="21"/>
+          <w:szCs w:val="21"/>
+        </w:rPr>
+        <w:t xml:space="preserve"> critical questions I think they should ask AI</w:t>
+      </w:r>
+    </w:p>
+    <w:p>
+      <w:pPr>
+        <w:spacing w:after="60"/>
+        <w:ind w:left="360" w:hanging="300"/>
+      </w:pPr>
+      <w:r>
+        <w:rPr>
+          <w:color w:val="131516"/>
+          <w:sz w:val="24"/>
+          <w:szCs w:val="24"/>
+        </w:rPr>
+        <w:t xml:space="preserve">☐  </w:t>
+      </w:r>
+      <w:r>
+        <w:rPr>
+          <w:b/>
+          <w:bCs/>
+          <w:color w:val="FFFFFF"/>
+          <w:sz w:val="15"/>
+          <w:szCs w:val="15"/>
+          <w:shd w:val="clear" w:color="auto" w:fill="9A2515"/>
+        </w:rPr>
+        <w:t xml:space="preserve"> FK </w:t>
+      </w:r>
+      <w:r>
+        <w:t xml:space="preserve">  </w:t>
+      </w:r>
+      <w:r>
+        <w:rPr>
+          <w:color w:val="131516"/>
+          <w:sz w:val="21"/>
+          <w:szCs w:val="21"/>
+        </w:rPr>
+        <w:t>May be a good</w:t>
+      </w:r>
+      <w:r>
+        <w:rPr>
+          <w:color w:val="131516"/>
+          <w:sz w:val="21"/>
+          <w:szCs w:val="21"/>
+        </w:rPr>
+        <w:t xml:space="preserve"> place to add some AI content</w:t>
+      </w:r>
+    </w:p>
+    <w:p>
+      <w:pPr>
+        <w:pBdr>
+          <w:bottom w:val="single" w:sz="2" w:space="0" w:color="00789E"/>
+        </w:pBdr>
+        <w:shd w:val="clear" w:color="auto" w:fill="00789E"/>
+        <w:spacing w:before="240" w:after="120"/>
+      </w:pPr>
+      <w:r>
+        <w:rPr>
+          <w:b/>
+          <w:bCs/>
+          <w:color w:val="FFFFFF"/>
+          <w:sz w:val="24"/>
+          <w:szCs w:val="24"/>
+        </w:rPr>
+        <w:t xml:space="preserve">  DAY 4 · Oct 15</w:t>
+      </w:r>
+    </w:p>
+    <w:p>
+      <w:pPr>
+        <w:pBdr>
+          <w:bottom w:val="single" w:sz="4" w:space="0" w:color="DCE1E3"/>
+        </w:pBdr>
+        <w:spacing w:before="140" w:after="40"/>
+      </w:pPr>
+      <w:r>
+        <w:rPr>
+          <w:b/>
+          <w:bCs/>
+          <w:color w:val="131516"/>
+          <w:sz w:val="22"/>
+          <w:szCs w:val="22"/>
+        </w:rPr>
+        <w:t>Session 1 — Is This Evidence Credible? / QA Deep Dive</w:t>
+      </w:r>
+    </w:p>
+    <w:p>
+      <w:pPr>
+        <w:spacing w:after="60"/>
+        <w:ind w:left="360" w:hanging="300"/>
+      </w:pPr>
+      <w:r>
+        <w:rPr>
+          <w:color w:val="131516"/>
+          <w:sz w:val="24"/>
+          <w:szCs w:val="24"/>
+        </w:rPr>
+        <w:t xml:space="preserve">☑  </w:t>
       </w:r>
       <w:r>
         <w:rPr>
@@ -2162,7 +2271,7 @@
           <w:sz w:val="16"/>
           <w:szCs w:val="16"/>
         </w:rPr>
-        <w:t>Checked items reflect drafts already in the Module_2_Oct_2026 folder (Oct 12 S1, Oct 12 S3, Oct 13 S1). Review and case-study work on those remains open.</w:t>
+        <w:t>All twelve sessions are built and published. Checked items are drafts that exist; the review passes, the PwC materials and the case studies that await real data all remain open.</w:t>
       </w:r>
     </w:p>
     <w:sectPr>

</xml_diff>